<commit_message>
fix: remove unused physical address tag from contract guide and delete temporary file
</commit_message>
<xml_diff>
--- a/public/contratos/Guia_Generacion_Contratos_Campuslands_Tags.docx
+++ b/public/contratos/Guia_Generacion_Contratos_Campuslands_Tags.docx
@@ -201,20 +201,6 @@
       </w:r>
       <w:r>
         <w:t>Número del representante.</w:t>
-      </w:r>
-    </w:p>
-    <w:p>
-      <w:pPr>
-        <w:pStyle w:val="Listaconvietas"/>
-      </w:pPr>
-      <w:r>
-        <w:rPr>
-          <w:b/>
-        </w:rPr>
-        <w:t xml:space="preserve">{DIRECCION FISICA}: </w:t>
-      </w:r>
-      <w:r>
-        <w:t>Dirección del camper o acudiente.</w:t>
       </w:r>
     </w:p>
     <w:p>

</xml_diff>